<commit_message>
Make US Letter the default template and the skill bilingual for Sngular USA
- Document templates: US Letter is now the default (Sngular_Document_Template.docx),
  A4 the alternative (Sngular_Document_Template_A4.docx). Both are generated with
  US English placeholders, an English style picker, and en-US proofing (D13).
  The Letter draft in drafts/templates/ is removed.
- make_templates.py: overlays on the cover and back cover are placed relative to
  the artwork, the sample table is inline with the text, and #4A94FF is dropped.
- documents.md: Letter default, D11-D13 updated, guidance for documents without a
  cover, and es-US proofing for Spanish documents.
- Skill language: US English or US Spanish in the language of the request, both
  with US formats, for Sngular USA.
- Rebuilt dist/sngular-design.skill.
</commit_message>
<xml_diff>
--- a/skills/sngular-design/assets/templates/Sngular_Document_Template.docx
+++ b/skills/sngular-design/assets/templates/Sngular_Document_Template.docx
@@ -35,7 +35,7 @@
         <w:rPr>
           <w:rtl w:val="0"/>
         </w:rPr>
-        <w:t xml:space="preserve">Guía rápida</w:t>
+        <w:t xml:space="preserve">Quick guide</w:t>
       </w:r>
     </w:p>
     <w:p>
@@ -51,7 +51,7 @@
         <w:rPr>
           <w:rtl w:val="0"/>
         </w:rPr>
-        <w:t xml:space="preserve">No empieces a usar esta plantilla hasta no haber leído con atención esta guía.</w:t>
+        <w:t xml:space="preserve">Read this guide carefully before you start using this template.</w:t>
       </w:r>
     </w:p>
     <w:p>
@@ -67,7 +67,7 @@
         <w:rPr>
           <w:rtl w:val="0"/>
         </w:rPr>
-        <w:t xml:space="preserve">Esta plantilla tiene definidos </w:t>
+        <w:t xml:space="preserve">This template comes with predefined </w:t>
       </w:r>
       <w:r>
         <w:rPr>
@@ -75,13 +75,13 @@
           <w:bCs w:val="1"/>
           <w:rtl w:val="0"/>
         </w:rPr>
-        <w:t xml:space="preserve">estilos de texto</w:t>
-      </w:r>
-      <w:r>
-        <w:rPr>
-          <w:rtl w:val="0"/>
-        </w:rPr>
-        <w:t xml:space="preserve"> para que puedas componer tu documento de la mejor forma posible. No crees ni uses estilos que no estén incluidos en este documento.</w:t>
+        <w:t xml:space="preserve">text styles</w:t>
+      </w:r>
+      <w:r>
+        <w:rPr>
+          <w:rtl w:val="0"/>
+        </w:rPr>
+        <w:t xml:space="preserve"> so you can lay out your document the right way. Don't create or use styles that aren't in this document.</w:t>
       </w:r>
     </w:p>
     <w:p>
@@ -143,7 +143,7 @@
         <w:rPr>
           <w:rtl w:val="0"/>
         </w:rPr>
-        <w:t xml:space="preserve">Cuando pegues texto de otro documento utiliza el atajo de teclado “Cmd+Shift+V” (para Mac) o “Ctrl+Shift+V” (en Windows). </w:t>
+        <w:t xml:space="preserve">When you paste text from another document, use “Cmd+Shift+V” (Mac) or “Ctrl+Shift+V” (Windows) to paste without formatting. </w:t>
       </w:r>
       <w:r>
         <w:rPr>
@@ -164,7 +164,7 @@
         <w:rPr>
           <w:rtl w:val="0"/>
         </w:rPr>
-        <w:t xml:space="preserve">Utiliza sólo colores de la paleta personalizada para el relleno de tus textos y tablas:</w:t>
+        <w:t xml:space="preserve">Use only colors from the custom palette for text and table fills:</w:t>
       </w:r>
       <w:r>
         <w:drawing>
@@ -239,7 +239,7 @@
         <w:rPr>
           <w:rtl w:val="0"/>
         </w:rPr>
-        <w:t xml:space="preserve">Para destacar textos dentro de párrafos utiliza la fuente </w:t>
+        <w:t xml:space="preserve">To emphasize text inside a paragraph, use </w:t>
       </w:r>
       <w:r>
         <w:rPr>
@@ -268,7 +268,7 @@
       <w:pPr>
         <w:pStyle w:val="Heading1"/>
         <w:rPr>
-          <w:color w:val="4a94ff"/>
+          <w:color w:val="061B2B"/>
           <w:sz w:val="32"/>
           <w:szCs w:val="32"/>
         </w:rPr>
@@ -300,7 +300,7 @@
           <w:szCs w:val="32"/>
           <w:rtl w:val="0"/>
         </w:rPr>
-        <w:t xml:space="preserve">Estilos de título y párrafos</w:t>
+        <w:t xml:space="preserve">Heading and paragraph styles</w:t>
       </w:r>
     </w:p>
     <w:p>
@@ -330,7 +330,7 @@
         <w:rPr>
           <w:rtl w:val="0"/>
         </w:rPr>
-        <w:t xml:space="preserve">Encabezado 1</w:t>
+        <w:t xml:space="preserve">Heading 1</w:t>
         <w:tab/>
       </w:r>
       <w:r>
@@ -340,7 +340,7 @@
           <w:szCs w:val="22"/>
           <w:rtl w:val="0"/>
         </w:rPr>
-        <w:t xml:space="preserve">Estilo de título de las secciones.</w:t>
+        <w:t xml:space="preserve">Section titles.</w:t>
       </w:r>
       <w:r>
         <w:rPr>
@@ -361,7 +361,7 @@
         <w:rPr>
           <w:rtl w:val="0"/>
         </w:rPr>
-        <w:t xml:space="preserve">Encabezado 2</w:t>
+        <w:t xml:space="preserve">Heading 2</w:t>
         <w:tab/>
         <w:tab/>
       </w:r>
@@ -372,7 +372,7 @@
           <w:szCs w:val="22"/>
           <w:rtl w:val="0"/>
         </w:rPr>
-        <w:t xml:space="preserve">Estilo de título de las subsecciones.</w:t>
+        <w:t xml:space="preserve">Subsection titles.</w:t>
       </w:r>
       <w:r>
         <w:rPr>
@@ -392,7 +392,7 @@
         <w:rPr>
           <w:rtl w:val="0"/>
         </w:rPr>
-        <w:t xml:space="preserve">Encabezado 3</w:t>
+        <w:t xml:space="preserve">Heading 3</w:t>
         <w:tab/>
         <w:tab/>
         <w:tab/>
@@ -404,7 +404,7 @@
           <w:szCs w:val="22"/>
           <w:rtl w:val="0"/>
         </w:rPr>
-        <w:t xml:space="preserve">Estilo de título de los apartados.</w:t>
+        <w:t xml:space="preserve">Topic titles.</w:t>
       </w:r>
       <w:r>
         <w:rPr>
@@ -424,7 +424,7 @@
         <w:rPr>
           <w:rtl w:val="0"/>
         </w:rPr>
-        <w:t xml:space="preserve">Encabezado 4</w:t>
+        <w:t xml:space="preserve">Heading 4</w:t>
         <w:tab/>
         <w:tab/>
         <w:tab/>
@@ -436,7 +436,7 @@
           <w:szCs w:val="20"/>
           <w:rtl w:val="0"/>
         </w:rPr>
-        <w:t xml:space="preserve">Estilo de título de los subapartados.</w:t>
+        <w:t xml:space="preserve">Subtopic titles.</w:t>
       </w:r>
       <w:r>
         <w:rPr>
@@ -455,7 +455,7 @@
         <w:rPr>
           <w:rtl w:val="0"/>
         </w:rPr>
-        <w:t xml:space="preserve">Encabezado 5</w:t>
+        <w:t xml:space="preserve">Heading 5</w:t>
       </w:r>
       <w:r>
         <w:rPr>
@@ -464,7 +464,7 @@
         <w:tab/>
         <w:tab/>
         <w:tab/>
-        <w:t xml:space="preserve">Estilo de enlaces.</w:t>
+        <w:t xml:space="preserve">Links.</w:t>
       </w:r>
     </w:p>
     <w:p>
@@ -479,7 +479,7 @@
         <w:rPr>
           <w:rtl w:val="0"/>
         </w:rPr>
-        <w:t xml:space="preserve">Encabezado 6</w:t>
+        <w:t xml:space="preserve">Heading 6</w:t>
         <w:tab/>
         <w:tab/>
         <w:tab/>
@@ -491,7 +491,7 @@
           <w:color w:val="000000"/>
           <w:rtl w:val="0"/>
         </w:rPr>
-        <w:t xml:space="preserve">Estilo de citas.</w:t>
+        <w:t xml:space="preserve">Quotes.</w:t>
       </w:r>
       <w:r>
         <w:rPr>
@@ -508,7 +508,7 @@
         <w:rPr>
           <w:rtl w:val="0"/>
         </w:rPr>
-        <w:t xml:space="preserve">Texto de párrafo</w:t>
+        <w:t xml:space="preserve">Paragraph text</w:t>
         <w:tab/>
         <w:tab/>
         <w:tab/>
@@ -518,7 +518,7 @@
           <w:color w:val="000000"/>
           <w:rtl w:val="0"/>
         </w:rPr>
-        <w:t xml:space="preserve">Estilo de párrafos.</w:t>
+        <w:t xml:space="preserve">Paragraphs.</w:t>
       </w:r>
       <w:r>
         <w:rPr>
@@ -551,7 +551,7 @@
         <w:rPr>
           <w:rtl w:val="0"/>
         </w:rPr>
-        <w:t xml:space="preserve">Título de sección (encabezado 1)</w:t>
+        <w:t xml:space="preserve">Section title (Heading 1)</w:t>
       </w:r>
       <w:r>
         <w:rPr>
@@ -590,7 +590,7 @@
         <w:rPr>
           <w:rtl w:val="0"/>
         </w:rPr>
-        <w:t xml:space="preserve">Visitar enlace (encabezado 5)</w:t>
+        <w:t xml:space="preserve">Visit link (Heading 5)</w:t>
       </w:r>
       <w:r>
         <w:rPr>
@@ -610,7 +610,7 @@
         <w:rPr>
           <w:rtl w:val="0"/>
         </w:rPr>
-        <w:t xml:space="preserve">Subsección (Encabezado 2)</w:t>
+        <w:t xml:space="preserve">Subsection (Heading 2)</w:t>
       </w:r>
     </w:p>
     <w:p>
@@ -637,7 +637,7 @@
         <w:rPr>
           <w:rtl w:val="0"/>
         </w:rPr>
-        <w:t xml:space="preserve">Apartado (Encabezado 3)</w:t>
+        <w:t xml:space="preserve">Topic (Heading 3)</w:t>
       </w:r>
     </w:p>
     <w:p>
@@ -664,7 +664,7 @@
         <w:rPr>
           <w:rtl w:val="0"/>
         </w:rPr>
-        <w:t xml:space="preserve">Subapartado (Encabezado 4)</w:t>
+        <w:t xml:space="preserve">Subtopic (Heading 4)</w:t>
       </w:r>
     </w:p>
     <w:p>
@@ -679,7 +679,7 @@
         <w:rPr>
           <w:rtl w:val="0"/>
         </w:rPr>
-        <w:t xml:space="preserve">“Ut enim ad minim veniam, quis nostrud exercitation ullamco laboris nisi ut aliquip ex ea commodo consequat.” (Encabezado 6)</w:t>
+        <w:t xml:space="preserve">“Ut enim ad minim veniam, quis nostrud exercitation ullamco laboris nisi ut aliquip ex ea commodo consequat.” (Heading 6)</w:t>
       </w:r>
     </w:p>
     <w:p>
@@ -720,40 +720,39 @@
           <w:color w:val="0070F6"/>
           <w:rtl w:val="0"/>
         </w:rPr>
-        <w:t xml:space="preserve">Tablas</w:t>
+        <w:t xml:space="preserve">Tables</w:t>
       </w:r>
     </w:p>
     <w:tbl>
       <w:tblPr>
         <w:tblStyle w:val="Table1"/>
-        <w:tblpPr w:leftFromText="180" w:rightFromText="180" w:topFromText="180" w:bottomFromText="180" w:vertAnchor="text" w:horzAnchor="text" w:tblpX="-420" w:tblpY="0"/>
-        <w:tblW w:w="9867" w:type="dxa"/>
+        <w:tblW w:w="10198" w:type="dxa"/>
         <w:jc w:val="left"/>
         <w:tblInd w:w="0" w:type="dxa"/>
         <w:tblBorders>
-          <w:top w:color="4a94ff" w:space="0" w:sz="4" w:val="single"/>
-          <w:left w:color="4a94ff" w:space="0" w:sz="4" w:val="single"/>
-          <w:bottom w:color="4a94ff" w:space="0" w:sz="4" w:val="single"/>
-          <w:right w:color="4a94ff" w:space="0" w:sz="4" w:val="single"/>
-          <w:insideH w:color="4a94ff" w:space="0" w:sz="4" w:val="single"/>
-          <w:insideV w:color="4a94ff" w:space="0" w:sz="4" w:val="single"/>
+          <w:top w:color="FFFFFF" w:space="0" w:sz="4" w:val="single"/>
+          <w:left w:color="FFFFFF" w:space="0" w:sz="4" w:val="single"/>
+          <w:bottom w:color="FFFFFF" w:space="0" w:sz="4" w:val="single"/>
+          <w:right w:color="FFFFFF" w:space="0" w:sz="4" w:val="single"/>
+          <w:insideH w:color="FFFFFF" w:space="0" w:sz="4" w:val="single"/>
+          <w:insideV w:color="FFFFFF" w:space="0" w:sz="4" w:val="single"/>
         </w:tblBorders>
         <w:tblLayout w:type="fixed"/>
         <w:tblLook w:val="0600"/>
       </w:tblPr>
       <w:tblGrid>
-        <w:gridCol w:w="2057"/>
-        <w:gridCol w:w="1953"/>
-        <w:gridCol w:w="1953"/>
-        <w:gridCol w:w="1953"/>
-        <w:gridCol w:w="1953"/>
+        <w:gridCol w:w="2126"/>
+        <w:gridCol w:w="2018"/>
+        <w:gridCol w:w="2018"/>
+        <w:gridCol w:w="2018"/>
+        <w:gridCol w:w="2018"/>
         <w:tblGridChange w:id="0">
           <w:tblGrid>
-            <w:gridCol w:w="2057"/>
-            <w:gridCol w:w="1953"/>
-            <w:gridCol w:w="1953"/>
-            <w:gridCol w:w="1953"/>
-            <w:gridCol w:w="1953"/>
+            <w:gridCol w:w="2126"/>
+            <w:gridCol w:w="2018"/>
+            <w:gridCol w:w="2018"/>
+            <w:gridCol w:w="2018"/>
+            <w:gridCol w:w="2018"/>
           </w:tblGrid>
         </w:tblGridChange>
       </w:tblGrid>
@@ -789,7 +788,7 @@
                 <w:szCs w:val="18"/>
                 <w:rtl w:val="0"/>
               </w:rPr>
-              <w:t xml:space="preserve">Escribe…</w:t>
+              <w:t xml:space="preserve">Type here…</w:t>
             </w:r>
           </w:p>
         </w:tc>
@@ -823,7 +822,7 @@
                 <w:szCs w:val="16"/>
                 <w:rtl w:val="0"/>
               </w:rPr>
-              <w:t xml:space="preserve">Nombre Columna</w:t>
+              <w:t xml:space="preserve">Column name</w:t>
             </w:r>
           </w:p>
         </w:tc>
@@ -857,7 +856,7 @@
                 <w:szCs w:val="16"/>
                 <w:rtl w:val="0"/>
               </w:rPr>
-              <w:t xml:space="preserve">Nombre Columna</w:t>
+              <w:t xml:space="preserve">Column name</w:t>
             </w:r>
           </w:p>
         </w:tc>
@@ -891,7 +890,7 @@
                 <w:szCs w:val="16"/>
                 <w:rtl w:val="0"/>
               </w:rPr>
-              <w:t xml:space="preserve">Nombre Columna</w:t>
+              <w:t xml:space="preserve">Column name</w:t>
             </w:r>
           </w:p>
         </w:tc>
@@ -925,7 +924,7 @@
                 <w:szCs w:val="16"/>
                 <w:rtl w:val="0"/>
               </w:rPr>
-              <w:t xml:space="preserve">Nombre Columna</w:t>
+              <w:t xml:space="preserve">Column name</w:t>
             </w:r>
           </w:p>
         </w:tc>
@@ -966,7 +965,7 @@
                 <w:szCs w:val="18"/>
                 <w:rtl w:val="0"/>
               </w:rPr>
-              <w:t xml:space="preserve">Nombre Fila</w:t>
+              <w:t xml:space="preserve">Row name</w:t>
             </w:r>
           </w:p>
         </w:tc>
@@ -1109,7 +1108,7 @@
                 <w:szCs w:val="18"/>
                 <w:rtl w:val="0"/>
               </w:rPr>
-              <w:t xml:space="preserve">Nombre Fila</w:t>
+              <w:t xml:space="preserve">Row name</w:t>
             </w:r>
           </w:p>
         </w:tc>
@@ -1252,7 +1251,7 @@
                 <w:szCs w:val="18"/>
                 <w:rtl w:val="0"/>
               </w:rPr>
-              <w:t xml:space="preserve">Nombre Fila</w:t>
+              <w:t xml:space="preserve">Row name</w:t>
             </w:r>
           </w:p>
         </w:tc>
@@ -1395,7 +1394,7 @@
                 <w:szCs w:val="18"/>
                 <w:rtl w:val="0"/>
               </w:rPr>
-              <w:t xml:space="preserve">Nombre Fila</w:t>
+              <w:t xml:space="preserve">Row name</w:t>
             </w:r>
           </w:p>
         </w:tc>
@@ -1557,7 +1556,7 @@
                 <wp:positionV relativeFrom="page">
                   <wp:posOffset>0</wp:posOffset>
                 </wp:positionV>
-                <wp:extent cx="7562215" cy="10695677"/>
+                <wp:extent cx="7772400" cy="10064128"/>
                 <wp:effectExtent b="0" l="0" r="0" t="0"/>
                 <wp:wrapNone/>
                 <wp:docPr id="1" name=""/>
@@ -1568,9 +1567,9 @@
                       <wpg:grpSpPr>
                         <a:xfrm>
                           <a:off x="0" y="0"/>
-                          <a:ext cx="7562215" cy="10695677"/>
+                          <a:ext cx="7772400" cy="10064128"/>
                           <a:chOff x="0" y="0"/>
-                          <a:chExt cx="7562215" cy="10695677"/>
+                          <a:chExt cx="7772400" cy="10064128"/>
                         </a:xfrm>
                       </wpg:grpSpPr>
                       <pic:pic>
@@ -1588,8 +1587,8 @@
                         </pic:blipFill>
                         <pic:spPr>
                           <a:xfrm>
-                            <a:off x="0" y="0"/>
-                            <a:ext cx="7562215" cy="10695677"/>
+                            <a:off x="656712" y="0"/>
+                            <a:ext cx="7115688" cy="10064127"/>
                           </a:xfrm>
                           <a:prstGeom prst="rect">
                             <a:avLst/>
@@ -1615,8 +1614,8 @@
                         </pic:blipFill>
                         <pic:spPr>
                           <a:xfrm>
-                            <a:off x="1786195" y="4842259"/>
-                            <a:ext cx="643650" cy="1007453"/>
+                            <a:off x="2456582" y="4557917"/>
+                            <a:ext cx="605866" cy="948294"/>
                           </a:xfrm>
                           <a:prstGeom prst="rect">
                             <a:avLst/>
@@ -1632,8 +1631,8 @@
                         <wps:cNvPr id="4" name="Shape 4"/>
                         <wps:spPr>
                           <a:xfrm>
-                            <a:off x="2429841" y="4842274"/>
-                            <a:ext cx="3341728" cy="934785"/>
+                            <a:off x="3062444" y="4557930"/>
+                            <a:ext cx="3068014" cy="879893"/>
                           </a:xfrm>
                           <a:prstGeom prst="rect">
                             <a:avLst/>
@@ -1648,7 +1647,7 @@
                             <w:p>
                               <w:pPr>
                                 <w:spacing w:after="0" w:before="0" w:line="240"/>
-                                <w:ind w:left="419" w:right="419" w:firstLine="0"/>
+                                <w:ind w:left="0" w:right="0" w:firstLine="0"/>
                                 <w:jc w:val="left"/>
                                 <w:textDirection w:val="btLr"/>
                               </w:pPr>
@@ -1669,7 +1668,7 @@
                             <w:p>
                               <w:pPr>
                                 <w:spacing w:after="0" w:before="0" w:line="240"/>
-                                <w:ind w:left="419" w:right="419" w:firstLine="0"/>
+                                <w:ind w:left="0" w:right="0" w:firstLine="0"/>
                                 <w:jc w:val="left"/>
                                 <w:textDirection w:val="btLr"/>
                               </w:pPr>
@@ -1721,7 +1720,7 @@
                 <wp:positionV relativeFrom="page">
                   <wp:posOffset>0</wp:posOffset>
                 </wp:positionV>
-                <wp:extent cx="7562215" cy="10695677"/>
+                <wp:extent cx="7772400" cy="10064128"/>
                 <wp:effectExtent b="0" l="0" r="0" t="0"/>
                 <wp:wrapNone/>
                 <wp:docPr id="1" name="image4.png"/>
@@ -1742,7 +1741,7 @@
                       <pic:spPr>
                         <a:xfrm>
                           <a:off x="0" y="0"/>
-                          <a:ext cx="7562215" cy="10695677"/>
+                          <a:ext cx="7772400" cy="10064128"/>
                         </a:xfrm>
                         <a:prstGeom prst="rect"/>
                         <a:ln/>
@@ -1766,7 +1765,7 @@
       <w:headerReference r:id="rId12" w:type="first"/>
       <w:footerReference r:id="rId13" w:type="default"/>
       <w:footerReference r:id="rId14" w:type="first"/>
-      <w:pgSz w:w="11909" w:h="16834" w:orient="portrait"/>
+      <w:pgSz w:w="12240" w:h="15840" w:orient="portrait"/>
       <w:pgMar w:top="1440" w:right="1021" w:bottom="1440" w:left="1021" w:header="567" w:footer="567" w:gutter="0"/>
       <w:pgNumType w:start="1"/>
       <w:titlePg w:val="1"/>
@@ -1780,7 +1779,7 @@
   <w:p>
     <w:pPr>
       <w:tabs>
-        <w:tab w:val="right" w:pos="9867"/>
+        <w:tab w:val="right" w:pos="10198"/>
       </w:tabs>
       <w:ind w:left="0" w:right="0" w:firstLine="0"/>
       <w:jc w:val="left"/>
@@ -1856,7 +1855,7 @@
         <wp:anchor allowOverlap="1" behindDoc="0" distB="114300" distT="114300" distL="114300" distR="114300" hidden="0" layoutInCell="1" locked="0" relativeHeight="0" simplePos="0">
           <wp:simplePos x="0" y="0"/>
           <wp:positionH relativeFrom="page">
-            <wp:posOffset>5810250</wp:posOffset>
+            <wp:posOffset>6020435</wp:posOffset>
           </wp:positionH>
           <wp:positionV relativeFrom="page">
             <wp:posOffset>283800</wp:posOffset>
@@ -1900,7 +1899,7 @@
         <w:szCs w:val="18"/>
         <w:rtl w:val="0"/>
       </w:rPr>
-      <w:t xml:space="preserve">Título del Documento Lorem ipsum dolor sit amet </w:t>
+      <w:t xml:space="preserve">Document title </w:t>
     </w:r>
     <w:r>
       <w:rPr>
@@ -1930,7 +1929,7 @@
               <wp:positionV relativeFrom="page">
                 <wp:posOffset>0</wp:posOffset>
               </wp:positionV>
-              <wp:extent cx="7562215" cy="10695677"/>
+              <wp:extent cx="7772400" cy="10064128"/>
               <wp:effectExtent b="0" l="0" r="0" t="0"/>
               <wp:wrapNone/>
               <wp:docPr id="2" name=""/>
@@ -1941,9 +1940,9 @@
                     <wpg:grpSpPr>
                       <a:xfrm>
                         <a:off x="0" y="0"/>
-                        <a:ext cx="7562215" cy="10695677"/>
+                        <a:ext cx="7772400" cy="10064128"/>
                         <a:chOff x="0" y="0"/>
-                        <a:chExt cx="7562215" cy="10695677"/>
+                        <a:chExt cx="7772400" cy="10064128"/>
                       </a:xfrm>
                     </wpg:grpSpPr>
                     <pic:pic>
@@ -1961,8 +1960,8 @@
                       </pic:blipFill>
                       <pic:spPr>
                         <a:xfrm>
-                          <a:off x="0" y="0"/>
-                          <a:ext cx="7562215" cy="10695677"/>
+                          <a:off x="656712" y="0"/>
+                          <a:ext cx="7115688" cy="10064127"/>
                         </a:xfrm>
                         <a:prstGeom prst="rect">
                           <a:avLst/>
@@ -1988,8 +1987,8 @@
                       </pic:blipFill>
                       <pic:spPr>
                         <a:xfrm>
-                          <a:off x="787312" y="4860780"/>
-                          <a:ext cx="833050" cy="1303904"/>
+                          <a:off x="1595298" y="4436957"/>
+                          <a:ext cx="760400" cy="1190213"/>
                         </a:xfrm>
                         <a:prstGeom prst="rect">
                           <a:avLst/>
@@ -2005,8 +2004,8 @@
                       <wps:cNvPr id="7" name="Shape 7"/>
                       <wps:spPr>
                         <a:xfrm>
-                          <a:off x="1620363" y="4860780"/>
-                          <a:ext cx="4650781" cy="1304091"/>
+                          <a:off x="2355699" y="4436957"/>
+                          <a:ext cx="4241320" cy="1190384"/>
                         </a:xfrm>
                         <a:prstGeom prst="rect">
                           <a:avLst/>
@@ -2021,7 +2020,7 @@
                           <w:p>
                             <w:pPr>
                               <w:spacing w:after="0" w:before="0" w:line="240"/>
-                              <w:ind w:left="419" w:right="419" w:firstLine="0"/>
+                              <w:ind w:left="0" w:right="0" w:firstLine="0"/>
                               <w:jc w:val="left"/>
                               <w:textDirection w:val="btLr"/>
                             </w:pPr>
@@ -2036,7 +2035,7 @@
                                 <w:sz w:val="48"/>
                                 <w:vertAlign w:val="baseline"/>
                               </w:rPr>
-                              <w:t xml:space="preserve">Pon un título aquí Lorem…</w:t>
+                              <w:t xml:space="preserve">Add your title here</w:t>
                             </w:r>
                           </w:p>
                         </w:txbxContent>
@@ -2050,8 +2049,8 @@
                       <wps:cNvPr id="8" name="Shape 8"/>
                       <wps:spPr>
                         <a:xfrm>
-                          <a:off x="641915" y="9272924"/>
-                          <a:ext cx="4650781" cy="345762"/>
+                          <a:off x="1463396" y="8464395"/>
+                          <a:ext cx="4241320" cy="315614"/>
                         </a:xfrm>
                         <a:prstGeom prst="rect">
                           <a:avLst/>
@@ -2066,7 +2065,7 @@
                           <w:p>
                             <w:pPr>
                               <w:spacing w:after="0" w:before="0" w:line="240"/>
-                              <w:ind w:left="419" w:right="419" w:firstLine="0"/>
+                              <w:ind w:left="0" w:right="0" w:firstLine="0"/>
                               <w:jc w:val="left"/>
                               <w:textDirection w:val="btLr"/>
                             </w:pPr>
@@ -2081,7 +2080,7 @@
                                 <w:sz w:val="24"/>
                                 <w:vertAlign w:val="baseline"/>
                               </w:rPr>
-                              <w:t xml:space="preserve">Día / Mes / Año</w:t>
+                              <w:t xml:space="preserve">Month Day, Year</w:t>
                             </w:r>
                           </w:p>
                         </w:txbxContent>
@@ -2106,7 +2105,7 @@
               <wp:positionV relativeFrom="page">
                 <wp:posOffset>0</wp:posOffset>
               </wp:positionV>
-              <wp:extent cx="7562215" cy="10695677"/>
+              <wp:extent cx="7772400" cy="10064128"/>
               <wp:effectExtent b="0" l="0" r="0" t="0"/>
               <wp:wrapNone/>
               <wp:docPr id="2" name="image5.png"/>
@@ -2127,7 +2126,7 @@
                     <pic:spPr>
                       <a:xfrm>
                         <a:off x="0" y="0"/>
-                        <a:ext cx="7562215" cy="10695677"/>
+                        <a:ext cx="7772400" cy="10064128"/>
                       </a:xfrm>
                       <a:prstGeom prst="rect"/>
                       <a:ln/>
@@ -2152,10 +2151,10 @@
             <wp:anchor allowOverlap="1" behindDoc="1" distB="114300" distT="114300" distL="114300" distR="114300" hidden="0" layoutInCell="1" locked="0" relativeHeight="0" simplePos="0">
               <wp:simplePos x="0" y="0"/>
               <wp:positionH relativeFrom="column">
-                <wp:posOffset>1085215</wp:posOffset>
+                <wp:posOffset>1639566</wp:posOffset>
               </wp:positionH>
               <wp:positionV relativeFrom="paragraph">
-                <wp:posOffset>4237350</wp:posOffset>
+                <wp:posOffset>3965887</wp:posOffset>
               </wp:positionV>
               <wp:extent cx="5238750" cy="914400"/>
               <wp:effectExtent b="0" l="0" r="0" t="0"/>
@@ -2184,7 +2183,7 @@
                         <w:p>
                           <w:pPr>
                             <w:spacing w:after="0" w:before="0" w:line="240"/>
-                            <w:ind w:left="419" w:right="419" w:firstLine="0"/>
+                            <w:ind w:left="0" w:right="0" w:firstLine="0"/>
                             <w:jc w:val="left"/>
                             <w:textDirection w:val="btLr"/>
                           </w:pPr>
@@ -2199,7 +2198,7 @@
                               <w:sz w:val="28"/>
                               <w:vertAlign w:val="baseline"/>
                             </w:rPr>
-                            <w:t xml:space="preserve">Pon el título aquí</w:t>
+                            <w:t xml:space="preserve">Add your title here</w:t>
                           </w:r>
                         </w:p>
                       </w:txbxContent>
@@ -2218,10 +2217,10 @@
             <wp:anchor allowOverlap="1" behindDoc="1" distB="114300" distT="114300" distL="114300" distR="114300" hidden="0" layoutInCell="1" locked="0" relativeHeight="0" simplePos="0">
               <wp:simplePos x="0" y="0"/>
               <wp:positionH relativeFrom="column">
-                <wp:posOffset>1085215</wp:posOffset>
+                <wp:posOffset>1639566</wp:posOffset>
               </wp:positionH>
               <wp:positionV relativeFrom="paragraph">
-                <wp:posOffset>4237350</wp:posOffset>
+                <wp:posOffset>3965887</wp:posOffset>
               </wp:positionV>
               <wp:extent cx="5238750" cy="914400"/>
               <wp:effectExtent b="0" l="0" r="0" t="0"/>
@@ -2386,7 +2385,7 @@
       <w:rPr>
         <w:rFonts w:ascii="Verdana" w:cs="Verdana" w:eastAsia="Verdana" w:hAnsi="Verdana"/>
         <w:color w:val="061b2b"/>
-        <w:lang w:val="es"/>
+        <w:lang w:val="en-US"/>
       </w:rPr>
     </w:rPrDefault>
     <w:pPrDefault>

</xml_diff>